<commit_message>
Fix: App-Icon-Mismatch und Health-Kategorie-Fehldeklaration (Google-Play-Ablehnung 19.09.2026)
- App-Icon aus wellanni-icon-512.png neu generiert (war noch Capacitor-Platzhalter)
- glucoseDayRepo.js und Referenzen entfernt (Blutzucker-Reste in dataExportService.js/styles.css)
- Store-Text ueberarbeitet (45 vs. 15 Vitalstoffe klargestellt, PMS, ohne 'Gesundheitsbeobachtung')
</commit_message>
<xml_diff>
--- a/WellANNI_Playstore_Texte_2026.docx
+++ b/WellANNI_Playstore_Texte_2026.docx
@@ -7,7 +7,6 @@
         <w:spacing w:after="40"/>
         <w:jc w:val="center"/>
       </w:pPr>
-      <w:proofErr w:type="spellStart"/>
       <w:r>
         <w:rPr>
           <w:b/>
@@ -18,7 +17,6 @@
         </w:rPr>
         <w:t>WellANNI</w:t>
       </w:r>
-      <w:proofErr w:type="spellEnd"/>
     </w:p>
     <w:p>
       <w:pPr>
@@ -129,7 +127,7 @@
         <w:rPr>
           <w:rFonts w:ascii="Consolas" w:eastAsia="Consolas" w:hAnsi="Consolas" w:cs="Consolas"/>
         </w:rPr>
-        <w:t>47 Vitalstoffe, Zyklus &amp; Ernährung im Blick – 100% lokal, ganz ohne Cloud.</w:t>
+        <w:t>45 Vitalstoffe, Zyklus &amp; Ernährung im Blick – 100% lokal, ganz ohne Cloud.</w:t>
       </w:r>
     </w:p>
     <w:p>
@@ -199,25 +197,7 @@
           <w:iCs/>
           <w:color w:val="2F2F2F"/>
         </w:rPr>
-        <w:t xml:space="preserve">Play Console erlaubt seit 2024 A/B-Tests der Kurzbeschreibung (Store Listing Experiments) - alle drei Varianten </w:t>
-      </w:r>
-      <w:proofErr w:type="spellStart"/>
-      <w:r>
-        <w:rPr>
-          <w:i/>
-          <w:iCs/>
-          <w:color w:val="2F2F2F"/>
-        </w:rPr>
-        <w:t>koennen</w:t>
-      </w:r>
-      <w:proofErr w:type="spellEnd"/>
-      <w:r>
-        <w:rPr>
-          <w:i/>
-          <w:iCs/>
-          <w:color w:val="2F2F2F"/>
-        </w:rPr>
-        <w:t xml:space="preserve"> gegeneinander getestet werden, statt sich auf eine zu verlassen.</w:t>
+        <w:t xml:space="preserve">Play Console erlaubt seit 2024 A/B-Tests der Kurzbeschreibung (Store Listing Experiments) - alle drei Varianten koennen gegeneinander getestet werden, statt sich auf eine zu verlassen.</w:t>
       </w:r>
     </w:p>
     <w:p>
@@ -261,21 +241,7 @@
         <w:rPr>
           <w:rFonts w:ascii="Consolas" w:eastAsia="Consolas" w:hAnsi="Consolas" w:cs="Consolas"/>
         </w:rPr>
-        <w:t xml:space="preserve">Woher weißt du eigentlich, ob dir Vitamin D, Eisen oder Magnesium fehlen – ohne teure Bluttests auf Verdacht? </w:t>
-      </w:r>
-      <w:proofErr w:type="spellStart"/>
-      <w:r>
-        <w:rPr>
-          <w:rFonts w:ascii="Consolas" w:eastAsia="Consolas" w:hAnsi="Consolas" w:cs="Consolas"/>
-        </w:rPr>
-        <w:t>WellANNI</w:t>
-      </w:r>
-      <w:proofErr w:type="spellEnd"/>
-      <w:r>
-        <w:rPr>
-          <w:rFonts w:ascii="Consolas" w:eastAsia="Consolas" w:hAnsi="Consolas" w:cs="Consolas"/>
-        </w:rPr>
-        <w:t xml:space="preserve"> verbindet 47 Vitalstoffe, dein Ernährungstagebuch, deinen Zyklus und deine Alltags-Routinen an einem Ort, damit du siehst, was du wirklich brauchst.</w:t>
+        <w:t xml:space="preserve">Woher weißt du eigentlich, ob dir Vitamin D, Eisen oder Magnesium fehlen – ohne teure Bluttests auf Verdacht? WellANNI verbindet 45 Vitalstoffe, dein Ernährungstagebuch, deinen Zyklus und deine Alltags-Routinen an einem Ort, damit du siehst, was du wirklich brauchst.</w:t>
       </w:r>
     </w:p>
     <w:p>
@@ -299,21 +265,7 @@
         <w:rPr>
           <w:rFonts w:ascii="Consolas" w:eastAsia="Consolas" w:hAnsi="Consolas" w:cs="Consolas"/>
         </w:rPr>
-        <w:t xml:space="preserve">⚕️ WICHTIGER HINWEIS: </w:t>
-      </w:r>
-      <w:proofErr w:type="spellStart"/>
-      <w:r>
-        <w:rPr>
-          <w:rFonts w:ascii="Consolas" w:eastAsia="Consolas" w:hAnsi="Consolas" w:cs="Consolas"/>
-        </w:rPr>
-        <w:t>WellANNI</w:t>
-      </w:r>
-      <w:proofErr w:type="spellEnd"/>
-      <w:r>
-        <w:rPr>
-          <w:rFonts w:ascii="Consolas" w:eastAsia="Consolas" w:hAnsi="Consolas" w:cs="Consolas"/>
-        </w:rPr>
-        <w:t xml:space="preserve"> ist kein Medizinprodukt und ersetzt keine ärztliche Beratung, Diagnose oder Behandlung. Die App dient der persönlichen Gesundheitsbeobachtung im Wellness-Bereich.</w:t>
+        <w:t xml:space="preserve">⚕️ WICHTIGER HINWEIS: WellANNI ist kein Medizinprodukt und ersetzt keine ärztliche Beratung, Diagnose oder Behandlung. Die App dient der persönlichen Gesundheitsbeobachtung im Wellness-Bereich.</w:t>
       </w:r>
     </w:p>
     <w:p>
@@ -349,21 +301,7 @@
         <w:rPr>
           <w:rFonts w:ascii="Consolas" w:eastAsia="Consolas" w:hAnsi="Consolas" w:cs="Consolas"/>
         </w:rPr>
-        <w:t xml:space="preserve">Jeder der 47 Vitalstoffe zeigt dir konkret, wie du realistisch an deinen Wert kommst: automatisch aus dem Ernährungstagebuch, per </w:t>
-      </w:r>
-      <w:proofErr w:type="spellStart"/>
-      <w:r>
-        <w:rPr>
-          <w:rFonts w:ascii="Consolas" w:eastAsia="Consolas" w:hAnsi="Consolas" w:cs="Consolas"/>
-        </w:rPr>
-        <w:t>Heimtest</w:t>
-      </w:r>
-      <w:proofErr w:type="spellEnd"/>
-      <w:r>
-        <w:rPr>
-          <w:rFonts w:ascii="Consolas" w:eastAsia="Consolas" w:hAnsi="Consolas" w:cs="Consolas"/>
-        </w:rPr>
-        <w:t xml:space="preserve"> ohne Arzttermin, beim Hausarzt oder nur über Speziallabore. Eintragen und den aktuellen Wert sehen ist für alle 47 Vitalstoffe kostenlos. Für 15 Mikronährstoffe siehst du die Zufuhr-Deckung direkt aus dem, was du isst (Free: die 5 wichtigsten).</w:t>
+        <w:t xml:space="preserve">Jeder der 45 Vitalstoffe zeigt dir konkret, wie du realistisch an deinen Wert kommst: automatisch aus dem Ernährungstagebuch, per Heimtest ohne Arzttermin, beim Hausarzt oder nur über Speziallabore. Eintragen und den aktuellen Wert sehen ist für alle 45 Vitalstoffe kostenlos. Für 15 Mikronährstoffe siehst du die Zufuhr-Deckung direkt aus dem, was du isst (Free: die 5 wichtigsten).</w:t>
       </w:r>
     </w:p>
     <w:p>
@@ -400,13 +338,7 @@
           <w:rFonts w:ascii="Consolas" w:eastAsia="Consolas" w:hAnsi="Consolas" w:cs="Consolas"/>
         </w:rPr>
         <w:lastRenderedPageBreak/>
-        <w:t xml:space="preserve">Über 500 </w:t>
-      </w:r>
-      <w:r>
-        <w:rPr>
-          <w:rFonts w:ascii="Consolas" w:eastAsia="Consolas" w:hAnsi="Consolas" w:cs="Consolas"/>
-        </w:rPr>
-        <w:t>Rezepte (vegetarisch, mit Fleisch/Fisch, Keto) – Frühstück, Mittag, Abend, mit echter Abwechslung statt Wiederholung. Wochenplan mit automatischer Einkaufsliste, Unverträglichkeiten-Filter (Laktose/Gluten/Nüsse) und Barcode-Scan für Supermarktprodukte. Ein Rezept gekocht? Mit einem Klick direkt ins Ernährungstagebuch, inklusive Portionsgröße.</w:t>
+        <w:t xml:space="preserve">Über 500 Rezepte (vegetarisch, mit Fleisch/Fisch, Keto) – Frühstück, Mittag, Abend, mit echter Abwechslung statt Wiederholung. Wochenplan mit automatischer Einkaufsliste, Unverträglichkeiten-Filter (Laktose/Gluten/Nüsse) und Barcode-Scan für Supermarktprodukte. Ein Rezept gekocht? Mit einem Klick direkt ins Ernährungstagebuch, inklusive Portionsgröße.</w:t>
       </w:r>
     </w:p>
     <w:p>
@@ -442,21 +374,7 @@
         <w:rPr>
           <w:rFonts w:ascii="Consolas" w:eastAsia="Consolas" w:hAnsi="Consolas" w:cs="Consolas"/>
         </w:rPr>
-        <w:t xml:space="preserve">Zykluskalender mit Phasenberechnung, ein Symptom-Tagebuch, das rein </w:t>
-      </w:r>
-      <w:proofErr w:type="gramStart"/>
-      <w:r>
-        <w:rPr>
-          <w:rFonts w:ascii="Consolas" w:eastAsia="Consolas" w:hAnsi="Consolas" w:cs="Consolas"/>
-        </w:rPr>
-        <w:t>trackt</w:t>
-      </w:r>
-      <w:proofErr w:type="gramEnd"/>
-      <w:r>
-        <w:rPr>
-          <w:rFonts w:ascii="Consolas" w:eastAsia="Consolas" w:hAnsi="Consolas" w:cs="Consolas"/>
-        </w:rPr>
-        <w:t xml:space="preserve"> statt zu bewerten, und ein eigener Lernbereich zu PMS, Prämenopause und Menopause – welche Nährstoffe in welcher Lebensphase eine Rolle spielen, wissenschaftlich eingeordnet.</w:t>
+        <w:t xml:space="preserve">Zykluskalender mit Phasenberechnung, ein Symptom-Tagebuch, das rein trackt statt zu bewerten, und ein eigener Lernbereich zu PMS, Prämenopause und Menopause – welche Nährstoffe in welcher Lebensphase eine Rolle spielen, wissenschaftlich eingeordnet.</w:t>
       </w:r>
     </w:p>
     <w:p>
@@ -528,21 +446,7 @@
         <w:rPr>
           <w:rFonts w:ascii="Consolas" w:eastAsia="Consolas" w:hAnsi="Consolas" w:cs="Consolas"/>
         </w:rPr>
-        <w:t xml:space="preserve">Verlaufs-Charts und farbliche Einordnung für alle 47 Biomarker, Ernährungsverlauf über 12 Wochen für alle 15 Mikronährstoffe, ein Wochenrückblick über Bewegung/Ernährung/Fasten, ein Intervallfasten-Tracker mit Autophagie-Phasen &amp; </w:t>
-      </w:r>
-      <w:proofErr w:type="spellStart"/>
-      <w:r>
-        <w:rPr>
-          <w:rFonts w:ascii="Consolas" w:eastAsia="Consolas" w:hAnsi="Consolas" w:cs="Consolas"/>
-        </w:rPr>
-        <w:t>Streak</w:t>
-      </w:r>
-      <w:proofErr w:type="spellEnd"/>
-      <w:r>
-        <w:rPr>
-          <w:rFonts w:ascii="Consolas" w:eastAsia="Consolas" w:hAnsi="Consolas" w:cs="Consolas"/>
-        </w:rPr>
-        <w:t>, ein Blutzucker-Tagesgang zur Insulinresistenz-Erkennung sowie die Auswertung „Hautgesundheit &amp; Vitalität" (Vitamin C, Zink, Biotin &amp; Co., Darm-Haut-Achse).</w:t>
+        <w:t xml:space="preserve">Verlaufs-Charts und farbliche Einordnung für alle 45 Biomarker, Ernährungsverlauf über 12 Wochen für alle 15 Mikronährstoffe, ein Wochenrückblick über Bewegung/Ernährung/Fasten, ein Intervallfasten-Tracker mit Autophagie-Phasen &amp; Streak sowie die Auswertung „Beauty-Nährstoffe" (Vitamin C, Zink, Biotin &amp; Co., Darm-Haut-Achse für Haut, Haare &amp; Nägel).</w:t>
       </w:r>
     </w:p>
     <w:p>
@@ -638,21 +542,7 @@
         <w:rPr>
           <w:rFonts w:ascii="Consolas" w:eastAsia="Consolas" w:hAnsi="Consolas" w:cs="Consolas"/>
         </w:rPr>
-        <w:t xml:space="preserve">Lade </w:t>
-      </w:r>
-      <w:proofErr w:type="spellStart"/>
-      <w:r>
-        <w:rPr>
-          <w:rFonts w:ascii="Consolas" w:eastAsia="Consolas" w:hAnsi="Consolas" w:cs="Consolas"/>
-        </w:rPr>
-        <w:t>WellANNI</w:t>
-      </w:r>
-      <w:proofErr w:type="spellEnd"/>
-      <w:r>
-        <w:rPr>
-          <w:rFonts w:ascii="Consolas" w:eastAsia="Consolas" w:hAnsi="Consolas" w:cs="Consolas"/>
-        </w:rPr>
-        <w:t xml:space="preserve"> jetzt herunter und finde in wenigen Minuten heraus, worauf es bei deiner Ernährung wirklich ankommt.</w:t>
+        <w:t xml:space="preserve">Lade WellANNI jetzt herunter und finde in wenigen Minuten heraus, worauf es bei deiner Ernährung wirklich ankommt.</w:t>
       </w:r>
     </w:p>
     <w:p>
@@ -755,9 +645,27 @@
           <w:sz w:val="24"/>
           <w:szCs w:val="24"/>
         </w:rPr>
-        <w:t>Natürliche Sprache schlägt Keyword-</w:t>
-      </w:r>
-      <w:proofErr w:type="spellStart"/>
+        <w:t>Natürliche Sprache schlägt Keyword-Stuffing</w:t>
+      </w:r>
+    </w:p>
+    <w:p>
+      <w:pPr>
+        <w:spacing w:after="140"/>
+      </w:pPr>
+      <w:r>
+        <w:rPr>
+          <w:sz w:val="22"/>
+          <w:szCs w:val="22"/>
+        </w:rPr>
+        <w:lastRenderedPageBreak/>
+        <w:t xml:space="preserve">2026 gewichten sowohl Google als auch Nutzer:innen NLP-basiertes, natürlich klingendes Suchverhalten stärker als exakte Keyword-Wiederholung. Der Text ist deshalb bewusst in ganzen, alltagsnahen Sätzen geschrieben ("wie du realistisch an deinen Wert kommst") statt in Keyword-Fragmenten.</w:t>
+      </w:r>
+    </w:p>
+    <w:p>
+      <w:pPr>
+        <w:pStyle w:val="berschrift2"/>
+        <w:spacing w:before="220" w:after="100"/>
+      </w:pPr>
       <w:r>
         <w:rPr>
           <w:b/>
@@ -766,105 +674,19 @@
           <w:sz w:val="24"/>
           <w:szCs w:val="24"/>
         </w:rPr>
-        <w:t>Stuffing</w:t>
-      </w:r>
-      <w:proofErr w:type="spellEnd"/>
-    </w:p>
-    <w:p>
-      <w:pPr>
-        <w:spacing w:after="140"/>
-      </w:pPr>
-      <w:r>
-        <w:rPr>
-          <w:sz w:val="22"/>
-          <w:szCs w:val="22"/>
-        </w:rPr>
-        <w:lastRenderedPageBreak/>
-        <w:t xml:space="preserve">2026 gewichten sowohl Google als auch </w:t>
-      </w:r>
-      <w:proofErr w:type="spellStart"/>
-      <w:proofErr w:type="gramStart"/>
-      <w:r>
-        <w:rPr>
-          <w:sz w:val="22"/>
-          <w:szCs w:val="22"/>
-        </w:rPr>
-        <w:t>Nutzer:innen</w:t>
-      </w:r>
-      <w:proofErr w:type="spellEnd"/>
-      <w:proofErr w:type="gramEnd"/>
-      <w:r>
-        <w:rPr>
-          <w:sz w:val="22"/>
-          <w:szCs w:val="22"/>
-        </w:rPr>
-        <w:t xml:space="preserve"> NLP-basiertes, natürlich klingendes Suchverhalten stärker als exakte Keyword-Wiederholung. Der Text ist deshalb bewusst in ganzen, alltagsnahen Sätzen geschrieben ("wie du realistisch an deinen Wert kommst") statt in Keyword-Fragmenten.</w:t>
-      </w:r>
-    </w:p>
-    <w:p>
-      <w:pPr>
-        <w:pStyle w:val="berschrift2"/>
-        <w:spacing w:before="220" w:after="100"/>
-      </w:pPr>
-      <w:r>
-        <w:rPr>
-          <w:b/>
-          <w:bCs/>
-          <w:color w:val="0E7C7B"/>
-          <w:sz w:val="24"/>
-          <w:szCs w:val="24"/>
-        </w:rPr>
-        <w:t xml:space="preserve">Retention statt reiner </w:t>
-      </w:r>
-      <w:proofErr w:type="spellStart"/>
-      <w:r>
-        <w:rPr>
-          <w:b/>
-          <w:bCs/>
-          <w:color w:val="0E7C7B"/>
-          <w:sz w:val="24"/>
-          <w:szCs w:val="24"/>
-        </w:rPr>
-        <w:t>Install</w:t>
-      </w:r>
-      <w:proofErr w:type="spellEnd"/>
-      <w:r>
-        <w:rPr>
-          <w:b/>
-          <w:bCs/>
-          <w:color w:val="0E7C7B"/>
-          <w:sz w:val="24"/>
-          <w:szCs w:val="24"/>
-        </w:rPr>
-        <w:t>-Zahl</w:t>
-      </w:r>
-    </w:p>
-    <w:p>
-      <w:pPr>
-        <w:spacing w:after="140"/>
-      </w:pPr>
-      <w:r>
-        <w:rPr>
-          <w:sz w:val="22"/>
-          <w:szCs w:val="22"/>
-        </w:rPr>
-        <w:t xml:space="preserve">Google gewichtet laut aktueller Recherche seinen Ranking-Algorithmus zunehmend nach Bindung (Retention), nicht nur nach </w:t>
-      </w:r>
-      <w:proofErr w:type="spellStart"/>
-      <w:r>
-        <w:rPr>
-          <w:sz w:val="22"/>
-          <w:szCs w:val="22"/>
-        </w:rPr>
-        <w:t>Install</w:t>
-      </w:r>
-      <w:proofErr w:type="spellEnd"/>
-      <w:r>
-        <w:rPr>
-          <w:sz w:val="22"/>
-          <w:szCs w:val="22"/>
-        </w:rPr>
-        <w:t>-Volumen. Deshalb betont der Text bewusst Alltagsnutzen (Wochenrückblick, 12-Wochen-Verlauf, Rezept-Vielfalt) statt nur den ersten Download-Anreiz - wer die App nur einmal öffnet, hilft dem Ranking nicht.</w:t>
+        <w:t xml:space="preserve">Retention statt reiner Install-Zahl</w:t>
+      </w:r>
+    </w:p>
+    <w:p>
+      <w:pPr>
+        <w:spacing w:after="140"/>
+      </w:pPr>
+      <w:r>
+        <w:rPr>
+          <w:sz w:val="22"/>
+          <w:szCs w:val="22"/>
+        </w:rPr>
+        <w:t xml:space="preserve">Google gewichtet laut aktueller Recherche seinen Ranking-Algorithmus zunehmend nach Bindung (Retention), nicht nur nach Install-Volumen. Deshalb betont der Text bewusst Alltagsnutzen (Wochenrückblick, 12-Wochen-Verlauf, Rezept-Vielfalt) statt nur den ersten Download-Anreiz - wer die App nur einmal öffnet, hilft dem Ranking nicht.</w:t>
       </w:r>
     </w:p>
     <w:p>
@@ -909,53 +731,12 @@
         </w:numPr>
         <w:spacing w:after="80"/>
       </w:pPr>
-      <w:proofErr w:type="spellStart"/>
-      <w:r>
-        <w:rPr>
-          <w:sz w:val="22"/>
-          <w:szCs w:val="22"/>
-        </w:rPr>
-        <w:t>Consideration</w:t>
-      </w:r>
-      <w:proofErr w:type="spellEnd"/>
-      <w:r>
-        <w:rPr>
-          <w:sz w:val="22"/>
-          <w:szCs w:val="22"/>
-        </w:rPr>
-        <w:t xml:space="preserve">: Kernfunktionen in </w:t>
-      </w:r>
-      <w:proofErr w:type="spellStart"/>
-      <w:r>
-        <w:rPr>
-          <w:sz w:val="22"/>
-          <w:szCs w:val="22"/>
-        </w:rPr>
-        <w:t>scannenbaren</w:t>
-      </w:r>
-      <w:proofErr w:type="spellEnd"/>
-      <w:r>
-        <w:rPr>
-          <w:sz w:val="22"/>
-          <w:szCs w:val="22"/>
-        </w:rPr>
-        <w:t xml:space="preserve"> Blöcken mit Emoji-Anker (bewährtes Play-Store-Muster für schnelles </w:t>
-      </w:r>
-      <w:proofErr w:type="spellStart"/>
-      <w:r>
-        <w:rPr>
-          <w:sz w:val="22"/>
-          <w:szCs w:val="22"/>
-        </w:rPr>
-        <w:t>Ueberfliegen</w:t>
-      </w:r>
-      <w:proofErr w:type="spellEnd"/>
-      <w:r>
-        <w:rPr>
-          <w:sz w:val="22"/>
-          <w:szCs w:val="22"/>
-        </w:rPr>
-        <w:t>).</w:t>
+      <w:r>
+        <w:rPr>
+          <w:sz w:val="22"/>
+          <w:szCs w:val="22"/>
+        </w:rPr>
+        <w:t xml:space="preserve">Consideration: Kernfunktionen in scannenbaren Blöcken mit Emoji-Anker (bewährtes Play-Store-Muster für schnelles Ueberfliegen).</w:t>
       </w:r>
     </w:p>
     <w:p>
@@ -972,23 +753,7 @@
           <w:sz w:val="22"/>
           <w:szCs w:val="22"/>
         </w:rPr>
-        <w:t xml:space="preserve">Trust: eigener Datenschutz-Block ("100% lokal") - gerade bei Zyklus-/Gesundheitsdaten ein reales Entscheidungskriterium laut Recherche zu </w:t>
-      </w:r>
-      <w:proofErr w:type="spellStart"/>
-      <w:r>
-        <w:rPr>
-          <w:sz w:val="22"/>
-          <w:szCs w:val="22"/>
-        </w:rPr>
-        <w:t>Femtech</w:t>
-      </w:r>
-      <w:proofErr w:type="spellEnd"/>
-      <w:r>
-        <w:rPr>
-          <w:sz w:val="22"/>
-          <w:szCs w:val="22"/>
-        </w:rPr>
-        <w:t>-Vertrauen.</w:t>
+        <w:t xml:space="preserve">Trust: eigener Datenschutz-Block ("100% lokal") - gerade bei Zyklus-/Gesundheitsdaten ein reales Entscheidungskriterium laut Recherche zu Femtech-Vertrauen.</w:t>
       </w:r>
     </w:p>
     <w:p>
@@ -1000,21 +765,12 @@
         </w:numPr>
         <w:spacing w:after="80"/>
       </w:pPr>
-      <w:proofErr w:type="spellStart"/>
-      <w:r>
-        <w:rPr>
-          <w:sz w:val="22"/>
-          <w:szCs w:val="22"/>
-        </w:rPr>
-        <w:t>Decision</w:t>
-      </w:r>
-      <w:proofErr w:type="spellEnd"/>
-      <w:r>
-        <w:rPr>
-          <w:sz w:val="22"/>
-          <w:szCs w:val="22"/>
-        </w:rPr>
-        <w:t>/CTA: klarer Download-Aufruf im letzten Satz, statt die Beschreibung einfach auslaufen zu lassen.</w:t>
+      <w:r>
+        <w:rPr>
+          <w:sz w:val="22"/>
+          <w:szCs w:val="22"/>
+        </w:rPr>
+        <w:t>Decision/CTA: klarer Download-Aufruf im letzten Satz, statt die Beschreibung einfach auslaufen zu lassen.</w:t>
       </w:r>
     </w:p>
     <w:p>
@@ -1045,7 +801,7 @@
           <w:sz w:val="22"/>
           <w:szCs w:val="22"/>
         </w:rPr>
-        <w:t>Intervallfasten-Tracker, Blutzucker-Tagesgang und Wochenrückblick wurden von "frei" auf "Premium" umgestellt (komplett gesperrt, gleiches Muster wie "Hautgesundheit &amp; Vitalität"). Frei bleiben: alle 47 Biomarker eintragen/ansehen, Heißhunger-Journal, Wochenplan &amp; Einkaufsliste, Zyklustracker sowie PMS/Prämenopause/Menopause. Der Volltext oben ist bereits entsprechend angepasst - die drei Tools stehen jetzt im eigenen "⭐ PREMIUM"-Absatz statt im allgemeinen Health-Tools-Absatz.</w:t>
+        <w:t>Intervallfasten-Tracker und Wochenrückblick wurden von "frei" auf "Premium" umgestellt (komplett gesperrt, gleiches Muster wie "Beauty-Nährstoffe"). Frei bleiben: alle 45 Biomarker eintragen/ansehen, Heißhunger-Journal, Wochenplan &amp; Einkaufsliste, Zyklustracker sowie PMS/Prämenopause/Menopause. Der Volltext oben ist bereits entsprechend angepasst - die Tools stehen im eigenen "⭐ PREMIUM"-Absatz statt im allgemeinen Health-Tools-Absatz.</w:t>
       </w:r>
     </w:p>
     <w:p>
@@ -1115,23 +871,41 @@
           <w:sz w:val="22"/>
           <w:szCs w:val="22"/>
         </w:rPr>
-        <w:t xml:space="preserve">Screenshots/Feature-Grafik inhaltlich </w:t>
-      </w:r>
-      <w:proofErr w:type="spellStart"/>
-      <w:r>
-        <w:rPr>
-          <w:sz w:val="22"/>
-          <w:szCs w:val="22"/>
-        </w:rPr>
-        <w:t>pruefen</w:t>
-      </w:r>
-      <w:proofErr w:type="spellEnd"/>
-      <w:r>
-        <w:rPr>
-          <w:sz w:val="22"/>
-          <w:szCs w:val="22"/>
-        </w:rPr>
-        <w:t>, ob sie zu den neuen Schwerpunkten (PMS/Menopause, Ernährungsverlauf, neue Premium-Tools) passen oder noch den alten Stand zeigen.</w:t>
+        <w:t xml:space="preserve">Screenshots/Feature-Grafik inhaltlich pruefen, ob sie zu den neuen Schwerpunkten (PMS/Menopause, Ernährungsverlauf, neue Premium-Tools) passen oder noch den alten Stand zeigen.</w:t>
+      </w:r>
+    </w:p>
+    <w:p>
+      <w:pPr>
+        <w:pStyle w:val="Listenabsatz"/>
+        <w:numPr>
+          <w:ilvl w:val="0"/>
+          <w:numId w:val="2"/>
+        </w:numPr>
+        <w:spacing w:after="80"/>
+      </w:pPr>
+      <w:r>
+        <w:rPr>
+          <w:sz w:val="22"/>
+          <w:szCs w:val="22"/>
+        </w:rPr>
+        <w:t xml:space="preserve">Health-Apps-Formular in der Play Console (Policy &gt; App content &gt; Health Apps): nur die "Health and fitness"-Kategorien ankreuzen (Activity and Fitness, Nutrition and Weight Management, Period Tracking, Sleep Management) - NICHT "Diseases and Conditions Management". Sonst verlangt Google zwingend einen Organization-Account (D-U-N-S-Nummer) statt des bestehenden Personal-Accounts.</w:t>
+      </w:r>
+    </w:p>
+    <w:p>
+      <w:pPr>
+        <w:pStyle w:val="Listenabsatz"/>
+        <w:numPr>
+          <w:ilvl w:val="0"/>
+          <w:numId w:val="2"/>
+        </w:numPr>
+        <w:spacing w:after="80"/>
+      </w:pPr>
+      <w:r>
+        <w:rPr>
+          <w:sz w:val="22"/>
+          <w:szCs w:val="22"/>
+        </w:rPr>
+        <w:t xml:space="preserve">Pruefen, ob "Insulinresistenz" oder "Hautgesundheit" noch in Screenshots oder der Feature-Grafik auftaucht - dort ebenfalls auf "Beauty-Nährstoffe" umstellen.</w:t>
       </w:r>
     </w:p>
     <w:p>
@@ -1150,6 +924,383 @@
           <w:sz w:val="28"/>
           <w:szCs w:val="28"/>
         </w:rPr>
+        <w:t>7. Aktualisierung 08.09.2026: Blutzucker-Tagesgang entfernt, Beauty-Nährstoffe statt Hautgesundheit</w:t>
+      </w:r>
+    </w:p>
+    <w:p>
+      <w:pPr>
+        <w:spacing w:after="140"/>
+      </w:pPr>
+      <w:r>
+        <w:rPr>
+          <w:sz w:val="22"/>
+          <w:szCs w:val="22"/>
+        </w:rPr>
+        <w:t xml:space="preserve">Google hat WellANNI wegen fehlender Organization-Account-Registrierung abgelehnt (Play Console Requirements: "Diseases and Conditions Management" erfordert zwingend einen Organization-Account statt Personal-Account). Statt die Organisation umzustellen, wurde der Blutzucker-Tagesgang (bisher: Insulinresistenz-Warnung mit Diabetes-Schwellenwerten) komplett aus der App entfernt - er war ohnehin nicht der eigentliche Nutzwert (der liegt beim Heißhunger-Journal). Die "Hautgesundheit &amp; Vitalität"-Auswertung bleibt erhalten, wurde aber zu "Beauty-Nährstoffe" umbenannt (reine Ernährungs-/Beauty-Sprache statt "Gesundheit"/"skin care"), um in der Kategorie "Nutrition and Weight Management" zu bleiben statt "Diseases and Conditions Management". Ziel: WellANNI bleibt bewusst eine Wellness-App, kein Medical-Produkt - siehe healthClaims.js in der Codebasis.</w:t>
+      </w:r>
+    </w:p>
+    <w:p>
+      <w:pPr>
+        <w:pStyle w:val="berschrift1"/>
+        <w:pBdr>
+          <w:bottom w:val="single" w:sz="6" w:space="4" w:color="0E7C7B"/>
+        </w:pBdr>
+        <w:spacing w:before="320" w:after="160"/>
+      </w:pPr>
+      <w:r>
+        <w:rPr>
+          <w:b/>
+          <w:bCs/>
+          <w:color w:val="1B3A57"/>
+          <w:sz w:val="28"/>
+          <w:szCs w:val="28"/>
+        </w:rPr>
+        <w:t>8. Aktualisierung 09.09.2026: Build-Bug behoben, Marker-Anzahl 46, weitere Formulierungen entschärft</w:t>
+      </w:r>
+    </w:p>
+    <w:p>
+      <w:pPr>
+        <w:spacing w:after="140"/>
+      </w:pPr>
+      <w:r>
+        <w:rPr>
+          <w:sz w:val="22"/>
+          <w:szCs w:val="22"/>
+        </w:rPr>
+        <w:t xml:space="preserve">Kritischer Fund: scripts/build-release.mjs hat den Zielordner dist-release/ nie bereinigt, nur ueberschrieben. Bereits geloeschte Dateien (glucose.js, medicationInteractions.js) blieben dadurch als Karteileichen im tatsaechlich hochgeladenen AAB erhalten und wurden von Google als lesbarer Klartext erkannt - das war vermutlich die eigentliche Ursache fuer die wiederholten Ablehnungen wegen "Medikations-" und "Krankheits- und Beschwerdemanagement". Build-Skript korrigiert (Zielordner wird jetzt vor jedem Release-Build vollstaendig neu aufgebaut), alle Alt-Build-Ordner geloescht.</w:t>
+      </w:r>
+    </w:p>
+    <w:p>
+      <w:pPr>
+        <w:spacing w:after="140"/>
+      </w:pPr>
+      <w:r>
+        <w:rPr>
+          <w:sz w:val="22"/>
+          <w:szCs w:val="22"/>
+        </w:rPr>
+        <w:t xml:space="preserve">Zusaetzlich auf Hinweis eines Kollegen entschaerft: Supplement-Empfehlungssprache in Onboarding und Free-Karte entfernt/abgeschwaecht, "Typische Mangelsymptome"-Ueberschrift neutralisiert, Fasten-Phasen "Tiefe Reinigung"/"Autophagie aktiv" umformuliert (keine unbelegten Wirkversprechen mehr). Ausserdem HbA1c und Nuechternblutzucker komplett aus dem Biomarker-Katalog entfernt (enthielten Diabetes-/Praediabetes-Schwellenwerte) - Marker-Anzahl daher ueberall von 47 auf 46 korrigiert (Kurzbeschreibung, Volltext, Premium-Absatz).</w:t>
+      </w:r>
+    </w:p>
+    <w:p>
+      <w:pPr>
+        <w:pStyle w:val="berschrift1"/>
+        <w:pBdr>
+          <w:bottom w:val="single" w:sz="6" w:space="4" w:color="0E7C7B"/>
+        </w:pBdr>
+        <w:spacing w:before="320" w:after="160"/>
+      </w:pPr>
+      <w:r>
+        <w:rPr>
+          <w:b/>
+          <w:bCs/>
+          <w:color w:val="1B3A57"/>
+          <w:sz w:val="28"/>
+          <w:szCs w:val="28"/>
+        </w:rPr>
+        <w:t>9. Aktualisierung 09.09.2026 (Teil 2): hsCRP entfernt, Marker-Anzahl 45</w:t>
+      </w:r>
+    </w:p>
+    <w:p>
+      <w:pPr>
+        <w:spacing w:after="140"/>
+      </w:pPr>
+      <w:r>
+        <w:rPr>
+          <w:sz w:val="22"/>
+          <w:szCs w:val="22"/>
+        </w:rPr>
+        <w:t xml:space="preserve">Zusätzlich den hsCRP-Marker (Entzündungswert) komplett aus dem Biomarker-Katalog entfernt - sein einziger "highSymptoms"-Eintrag nannte "Erhöhtes Risiko für Diabetes Typ 2", was denselben Compliance-Grund wie bei HbA1c/Nüchternblutzucker betrifft. Marker-Anzahl daher überall von 46 auf 45 korrigiert (Kurzbeschreibung, Volltext, Premium-Absatz, Abschnitt 5). Zusätzlich einen verwaisten Amazon-Affiliate-Verweis auf ein Blutzucker-Messgerät/Teststreifen entfernt (toter Code-Rest aus der bereits früher entfernten Blutzucker-Tagesgang-Funktion, ohne aktiven Verweis im Katalog, aber als Klartext im AAB enthalten). Der Diabetes-Hinweis im Heilfasten-Lerninhalt (fasting.js) bleibt bewusst stehen - er ist eine Kontraindikations-/Sicherheitsangabe, kein Diagnose- oder Wirkversprechen.</w:t>
+      </w:r>
+    </w:p>
+    <w:p>
+      <w:pPr>
+        <w:pStyle w:val="berschrift1"/>
+        <w:pBdr>
+          <w:bottom w:val="single" w:sz="6" w:space="4" w:color="0E7C7B"/>
+        </w:pBdr>
+        <w:spacing w:before="320" w:after="160"/>
+      </w:pPr>
+      <w:r>
+        <w:rPr>
+          <w:b/>
+          <w:bCs/>
+          <w:color w:val="1B3A57"/>
+          <w:sz w:val="28"/>
+          <w:szCs w:val="28"/>
+        </w:rPr>
+        <w:t>10. Aktualisierung 19.09.2026: Google-Ablehnung behoben (Health-Kategorie-Mismatch &amp; Icon-Mismatch)</w:t>
+      </w:r>
+    </w:p>
+    <w:p>
+      <w:pPr>
+        <w:spacing w:after="140"/>
+      </w:pPr>
+      <w:r>
+        <w:rPr>
+          <w:sz w:val="22"/>
+          <w:szCs w:val="22"/>
+        </w:rPr>
+        <w:t xml:space="preserve">Google hat den Store-Eintrag am 19.09.2026 aus zwei Gruenden abgelehnt: (1) Health Content Policy - die deklarierten Kategorien (Activity and Fitness, Nutrition and Weight Management, Period Tracking, Sleep Management, Disease and Condition Management) passten laut Google nicht zu den tatsaechlichen App-Inhalten; (2) Irrefuehrende Behauptungen - das installierte App-Icon wich vom Icon im Store-Eintrag ab.</w:t>
+      </w:r>
+    </w:p>
+    <w:p>
+      <w:pPr>
+        <w:spacing w:after="140"/>
+      </w:pPr>
+      <w:r>
+        <w:rPr>
+          <w:sz w:val="22"/>
+          <w:szCs w:val="22"/>
+        </w:rPr>
+        <w:t xml:space="preserve">Icon-Ursache: android/app/src/main/res/mipmap-*/ic_launcher.png war noch das Capacitor-Standard-Platzhaltericon (blaues X, nie ersetzt). Der Store-Eintrag zeigte dagegen bereits play-store-assets/wellanni-icon-512.png (tuerkises Herz, Version-2.0.2-Commit). Fix: alle mipmap-Icons (ic_launcher, ic_launcher_round, ic_launcher_foreground) fuer mdpi bis xxxhdpi aus wellanni-icon-512.png neu generiert, Adaptive-Icon-Hintergrundfarbe von Weiss auf #0F9B8E (passendes Tuerkis) gesetzt.</w:t>
+      </w:r>
+    </w:p>
+    <w:p>
+      <w:pPr>
+        <w:spacing w:after="140"/>
+      </w:pPr>
+      <w:r>
+        <w:rPr>
+          <w:sz w:val="22"/>
+          <w:szCs w:val="22"/>
+        </w:rPr>
+        <w:t xml:space="preserve">Kategorie-Mismatch-Ursache: glucoseDayRepo.js (Blutzucker-Tagesgang-Datenschicht) existierte trotz Entfernung der zugehoerigen UI am 08.09.2026 weiterhin in app/src und war aktiv ueber dataExportService.js (Backup-Export/Import) eingebunden - Klartext-Reste wie „Blutzucker“ blieben dadurch im Code. Zusaetzlich hatte npx cap sync android den Ordner android/app/src/main/assets/public/ - das ist der Ordner, der tatsaechlich in die AAB einfliesst - seit dem letzten Sync nicht neu bereinigt. Die alte, unbereinigte Version lag dort weiter, unabhaengig vom dist-release-Fix vom 09.09.2026 (Abschnitt 8).</w:t>
+      </w:r>
+    </w:p>
+    <w:p>
+      <w:pPr>
+        <w:spacing w:after="140"/>
+      </w:pPr>
+      <w:r>
+        <w:rPr>
+          <w:sz w:val="22"/>
+          <w:szCs w:val="22"/>
+        </w:rPr>
+        <w:t xml:space="preserve">Fix: glucoseDayRepo.js geloescht, Imports/Aufrufe in dataExportService.js entfernt, verwaiste .glucose-*-CSS-Klassen aus app/assets/styles.css entfernt, glucoseDay-Testfall in tests/infra/dataExportService.test.js angepasst. dist-release neu gebaut (npm run build:release) und npx cap sync android erneut ausgefuehrt - der Android-Assets-Ordner enthaelt jetzt keine Blutzucker-/Diabetes-Referenzen mehr. npm test: 355/355 bestanden.</w:t>
+      </w:r>
+    </w:p>
+    <w:p>
+      <w:pPr>
+        <w:spacing w:after="140"/>
+      </w:pPr>
+      <w:r>
+        <w:rPr>
+          <w:sz w:val="22"/>
+          <w:szCs w:val="22"/>
+        </w:rPr>
+        <w:t xml:space="preserve">Store-Text komplett ueberarbeitet: klare Trennung zwischen den 45 insgesamt trackbaren Vitalstoffen (kompletter Katalog, Wert manuell/per Test/Labor eintragbar) und den 15 Mikronaehrstoffen mit automatischer Zufuhr-Berechnung aus dem Ernaehrungstagebuch (Free: 5) - vorher waren beide Zahlen ohne Erklaerung nebeneinandergestellt, was missverstaendlich war. Ausserdem: „Gesundheitsbeobachtung“ durch unverbindlichere Formulierung ersetzt (kein Versprechen einer Wirkung), PMS bereits im ersten Absatz erwaehnt (Trend-Thema), Abschnitt „ERNAEHRUNG ZUERST“ in „DEINE ERNAEHRUNG“ umbenannt, Kurzbeschreibung entschaerft (vorher faelschlich alle 45 Vitalstoffe an „aus deiner Ernaehrung“ gekoppelt).</w:t>
+      </w:r>
+    </w:p>
+    <w:p>
+      <w:pPr>
+        <w:spacing w:before="200" w:after="80"/>
+      </w:pPr>
+      <w:r>
+        <w:rPr>
+          <w:b/>
+          <w:bCs/>
+          <w:sz w:val="22"/>
+          <w:szCs w:val="22"/>
+        </w:rPr>
+        <w:t xml:space="preserve">Neuer finaler Text (ersetzt Abschnitt 2 und 3 oben; Stand 19.09.2026):</w:t>
+      </w:r>
+    </w:p>
+    <w:p>
+      <w:pPr>
+        <w:spacing w:before="200" w:after="80"/>
+      </w:pPr>
+      <w:r>
+        <w:rPr>
+          <w:b/>
+          <w:bCs/>
+          <w:sz w:val="22"/>
+          <w:szCs w:val="22"/>
+        </w:rPr>
+        <w:t xml:space="preserve">Kurzbeschreibung (57 Zeichen):</w:t>
+      </w:r>
+    </w:p>
+    <w:p>
+      <w:pPr>
+        <w:spacing w:after="140"/>
+      </w:pPr>
+      <w:r>
+        <w:rPr>
+          <w:sz w:val="22"/>
+          <w:szCs w:val="22"/>
+        </w:rPr>
+        <w:t xml:space="preserve">Mehr als Kalorien: 45 Vitalstoffe, Zyklus &amp; PMS im Blick.</w:t>
+      </w:r>
+    </w:p>
+    <w:p>
+      <w:pPr>
+        <w:spacing w:before="200" w:after="80"/>
+      </w:pPr>
+      <w:r>
+        <w:rPr>
+          <w:b/>
+          <w:bCs/>
+          <w:sz w:val="22"/>
+          <w:szCs w:val="22"/>
+        </w:rPr>
+        <w:t xml:space="preserve">Vollstaendige Beschreibung (2.356 Zeichen):</w:t>
+      </w:r>
+    </w:p>
+    <w:p>
+      <w:pPr>
+        <w:spacing w:after="140"/>
+      </w:pPr>
+      <w:r>
+        <w:rPr>
+          <w:sz w:val="22"/>
+          <w:szCs w:val="22"/>
+        </w:rPr>
+        <w:t xml:space="preserve">Es steckt mehr in deiner Ernährung als Kalorien, Eiweiß, Fett und Kohlenhydrate. WellANNI schaut weiter: auf 45 Vitamine und Mineralstoffe, die zum Beispiel bei Energie, Zyklus und PMS eine Rolle spielen – nicht nur auf Makronährstoffe.</w:t>
+      </w:r>
+    </w:p>
+    <w:p>
+      <w:pPr>
+        <w:spacing w:after="140"/>
+      </w:pPr>
+      <w:r>
+        <w:rPr>
+          <w:sz w:val="22"/>
+          <w:szCs w:val="22"/>
+        </w:rPr>
+        <w:t xml:space="preserve">⚕️ WICHTIGER HINWEIS: WellANNI ist kein Medizinprodukt und ersetzt keine ärztliche Beratung, Diagnose oder Behandlung. Die App hilft dir dabei, besser zu verstehen, welchen Einfluss deine Ernährung auf dein Wohlbefinden haben kann.</w:t>
+      </w:r>
+    </w:p>
+    <w:p>
+      <w:pPr>
+        <w:spacing w:after="140"/>
+      </w:pPr>
+      <w:r>
+        <w:rPr>
+          <w:sz w:val="22"/>
+          <w:szCs w:val="22"/>
+        </w:rPr>
+        <w:t xml:space="preserve">🥗 DEINE ERNÄHRUNG
+Du trägst ein, was du isst, und WellANNI berechnet automatisch, wie gut du bei 15 zentralen Mikronährstoffen versorgt bist – im Abgleich mit den DGE-Referenzwerten (Free: die 5 wichtigsten). Die übrigen Vitalstoffe aus dem 45er-Katalog trägst du bei Bedarf mit einem gemessenen Wert ein (Heimtest, Hausarzt oder Speziallabor). Über 500 Rezepte (vegetarisch, mit Fleisch/Fisch, Keto), Wochenplan mit Einkaufsliste, Unverträglichkeiten-Filter und Barcode-Scan machen das Tracken zur Gewohnheit statt zur Pflicht.</w:t>
+      </w:r>
+    </w:p>
+    <w:p>
+      <w:pPr>
+        <w:spacing w:after="140"/>
+      </w:pPr>
+      <w:r>
+        <w:rPr>
+          <w:sz w:val="22"/>
+          <w:szCs w:val="22"/>
+        </w:rPr>
+        <w:t xml:space="preserve">🎯 VITALSTOFFE WIRKLICH VERSTEHEN
+Zu jedem der 45 Vitalstoffe erfährst du, wofür er im Körper wichtig ist und woran sich ein Mangel zeigen könnte – wissenschaftlich eingeordnet statt Bauchgefühl.</w:t>
+      </w:r>
+    </w:p>
+    <w:p>
+      <w:pPr>
+        <w:spacing w:after="140"/>
+      </w:pPr>
+      <w:r>
+        <w:rPr>
+          <w:sz w:val="22"/>
+          <w:szCs w:val="22"/>
+        </w:rPr>
+        <w:t xml:space="preserve">🌙 ZYKLUS, PMS &amp; MENOPAUSE
+Zykluskalender mit Phasenberechnung, ein Symptom-Tagebuch, das trackt statt zu bewerten, und ein Lernbereich zu PMS, Prämenopause und Menopause – welche Nährstoffe in welcher Lebensphase eine Rolle spielen.</w:t>
+      </w:r>
+    </w:p>
+    <w:p>
+      <w:pPr>
+        <w:spacing w:after="140"/>
+      </w:pPr>
+      <w:r>
+        <w:rPr>
+          <w:sz w:val="22"/>
+          <w:szCs w:val="22"/>
+        </w:rPr>
+        <w:t xml:space="preserve">⏱️ DER GANZE ALLTAG IM BLICK
+Bewegungs-, Hydration- und Schlaf-Tracking sowie ein Heißhunger-Journal mit Muster-Erkennung ergänzen das Bild – für einen echten Überblick über deinen Körper, nicht nur über dein Essen.</w:t>
+      </w:r>
+    </w:p>
+    <w:p>
+      <w:pPr>
+        <w:spacing w:after="140"/>
+      </w:pPr>
+      <w:r>
+        <w:rPr>
+          <w:sz w:val="22"/>
+          <w:szCs w:val="22"/>
+        </w:rPr>
+        <w:t xml:space="preserve">⭐ PREMIUM: TIEFE AUSWERTUNG
+Verlaufs-Charts für alle 45 Vitalstoffe, Ernährungsverlauf über 12 Wochen für alle 15 Mikronährstoffe, Wochenrückblick, Intervallfasten-Tracker mit Streak sowie die Auswertung „Beauty-Nährstoffe" (Vitamin C, Zink, Biotin &amp; Co. für Haut, Haare und Nägel).</w:t>
+      </w:r>
+    </w:p>
+    <w:p>
+      <w:pPr>
+        <w:spacing w:after="140"/>
+      </w:pPr>
+      <w:r>
+        <w:rPr>
+          <w:sz w:val="22"/>
+          <w:szCs w:val="22"/>
+        </w:rPr>
+        <w:t xml:space="preserve">🔒 100% LOKAL – KEIN SERVER, KEINE CLOUD
+Alle Daten bleiben ausschließlich auf deinem Gerät. Keine Registrierung, keine Datenweitergabe, kein Tracking durch Dritte.</w:t>
+      </w:r>
+    </w:p>
+    <w:p>
+      <w:pPr>
+        <w:spacing w:after="140"/>
+      </w:pPr>
+      <w:r>
+        <w:rPr>
+          <w:sz w:val="22"/>
+          <w:szCs w:val="22"/>
+        </w:rPr>
+        <w:t xml:space="preserve">📄 PDF-EXPORT &amp; BACKUP
+Berichte für dein nächstes Ernährungsberatungsgespräch. Eigene Daten jederzeit sichern oder aufs neue Gerät übertragen.</w:t>
+      </w:r>
+    </w:p>
+    <w:p>
+      <w:pPr>
+        <w:spacing w:after="140"/>
+      </w:pPr>
+      <w:r>
+        <w:rPr>
+          <w:sz w:val="22"/>
+          <w:szCs w:val="22"/>
+        </w:rPr>
+        <w:t xml:space="preserve">Lade WellANNI jetzt herunter und lerne, worauf es bei deiner Ernährung wirklich ankommt – weit über Kalorien hinaus.</w:t>
+      </w:r>
+    </w:p>
+    <w:p>
+      <w:pPr>
+        <w:spacing w:after="140"/>
+      </w:pPr>
+      <w:r>
+        <w:rPr>
+          <w:sz w:val="22"/>
+          <w:szCs w:val="22"/>
+        </w:rPr>
+        <w:t xml:space="preserve">Offene Punkte fuer dich: Aenderungen committen, npm run release fuer ein neues AAB, im Health-Apps-Formular der Play Console nochmal bestaetigen, dass „Disease and Condition Management“ weiterhin NICHT angekreuzt ist, neuen Store-Text und ggf. das Store-Icon (unveraendert, wellanni-icon-512.png) final in der Play Console pruefen.</w:t>
+      </w:r>
+    </w:p>
+    <w:p>
+      <w:pPr>
+        <w:pStyle w:val="berschrift1"/>
+        <w:pBdr>
+          <w:bottom w:val="single" w:sz="6" w:space="4" w:color="0E7C7B"/>
+        </w:pBdr>
+        <w:spacing w:before="320" w:after="160"/>
+      </w:pPr>
+      <w:r>
+        <w:rPr>
+          <w:b/>
+          <w:bCs/>
+          <w:color w:val="1B3A57"/>
+          <w:sz w:val="28"/>
+          <w:szCs w:val="28"/>
+        </w:rPr>
         <w:t>Quellen (Recherche-Grundlage)</w:t>
       </w:r>
     </w:p>
@@ -1163,25 +1314,33 @@
           <w:sz w:val="18"/>
           <w:szCs w:val="18"/>
         </w:rPr>
-        <w:t>ASO-Best-Practices 2026 (Volltext-Indexierung, natürliche Sprache statt Keyword-</w:t>
-      </w:r>
-      <w:proofErr w:type="spellStart"/>
+        <w:t>ASO-Best-Practices 2026 (Volltext-Indexierung, natürliche Sprache statt Keyword-Stuffing, Retention-Gewichtung): apptweak.com, asomobile.net, wildnetedge.com.</w:t>
+      </w:r>
+    </w:p>
+    <w:p>
+      <w:pPr>
+        <w:spacing w:after="140"/>
+      </w:pPr>
       <w:r>
         <w:rPr>
           <w:color w:val="6B6B6B"/>
           <w:sz w:val="18"/>
           <w:szCs w:val="18"/>
         </w:rPr>
-        <w:t>Stuffing</w:t>
-      </w:r>
-      <w:proofErr w:type="spellEnd"/>
+        <w:t xml:space="preserve">Customer-Journey-Struktur für App-Stores (7 Phasen: Awareness bis Advocacy): uxcam.com Mobile App Customer Journey Guide 2026, businessofapps.com.</w:t>
+      </w:r>
+    </w:p>
+    <w:p>
+      <w:pPr>
+        <w:spacing w:after="140"/>
+      </w:pPr>
       <w:r>
         <w:rPr>
           <w:color w:val="6B6B6B"/>
           <w:sz w:val="18"/>
           <w:szCs w:val="18"/>
         </w:rPr>
-        <w:t>, Retention-Gewichtung): apptweak.com, asomobile.net, wildnetedge.com.</w:t>
+        <w:t xml:space="preserve">Google-Play-Pflichthinweis fuer Nicht-Medizinprodukt-Apps im ersten Absatz (2026-Update): support.google.com Health Content and Services, myappmonitor.com Google Play Health Apps Update 2026.</w:t>
       </w:r>
     </w:p>
     <w:p>
@@ -1194,56 +1353,7 @@
           <w:sz w:val="18"/>
           <w:szCs w:val="18"/>
         </w:rPr>
-        <w:t xml:space="preserve">Customer-Journey-Struktur für App-Stores (7 Phasen: Awareness bis </w:t>
-      </w:r>
-      <w:proofErr w:type="spellStart"/>
-      <w:r>
-        <w:rPr>
-          <w:color w:val="6B6B6B"/>
-          <w:sz w:val="18"/>
-          <w:szCs w:val="18"/>
-        </w:rPr>
-        <w:t>Advocacy</w:t>
-      </w:r>
-      <w:proofErr w:type="spellEnd"/>
-      <w:r>
-        <w:rPr>
-          <w:color w:val="6B6B6B"/>
-          <w:sz w:val="18"/>
-          <w:szCs w:val="18"/>
-        </w:rPr>
-        <w:t>): uxcam.com Mobile App Customer Journey Guide 2026, businessofapps.com.</w:t>
-      </w:r>
-    </w:p>
-    <w:p>
-      <w:pPr>
-        <w:spacing w:after="140"/>
-      </w:pPr>
-      <w:r>
-        <w:rPr>
-          <w:color w:val="6B6B6B"/>
-          <w:sz w:val="18"/>
-          <w:szCs w:val="18"/>
-        </w:rPr>
-        <w:t xml:space="preserve">Google-Play-Pflichthinweis </w:t>
-      </w:r>
-      <w:proofErr w:type="spellStart"/>
-      <w:r>
-        <w:rPr>
-          <w:color w:val="6B6B6B"/>
-          <w:sz w:val="18"/>
-          <w:szCs w:val="18"/>
-        </w:rPr>
-        <w:t>fuer</w:t>
-      </w:r>
-      <w:proofErr w:type="spellEnd"/>
-      <w:r>
-        <w:rPr>
-          <w:color w:val="6B6B6B"/>
-          <w:sz w:val="18"/>
-          <w:szCs w:val="18"/>
-        </w:rPr>
-        <w:t xml:space="preserve"> Nicht-Medizinprodukt-Apps im ersten Absatz (2026-Update): support.google.com Health Content and Services, myappmonitor.com Google Play Health Apps Update 2026.</w:t>
+        <w:t xml:space="preserve">Play Console Requirements / Organization-Account-Pflicht fuer Medical-Kategorien, Health app categories (Diseases and Conditions Management inkl. skin care): support.google.com Play Console Requirements, support.google.com Health app categories and additional information.</w:t>
       </w:r>
     </w:p>
     <w:sectPr>

</xml_diff>